<commit_message>
Ajout du cahier des charges fini
</commit_message>
<xml_diff>
--- a/Cahier des charges.docx
+++ b/Cahier des charges.docx
@@ -25,7 +25,32 @@
         <w:rPr>
           <w:rtl w:val="0"/>
         </w:rPr>
-        <w:t xml:space="preserve">___________________________________________________________________________</w:t>
+      </w:r>
+    </w:p>
+    <w:p>
+      <w:pPr>
+        <w:pStyle w:val="Heading2"/>
+        <w:keepNext w:val="0"/>
+        <w:keepLines w:val="0"/>
+        <w:spacing w:after="80" w:lineRule="auto"/>
+        <w:rPr>
+          <w:b w:val="1"/>
+          <w:bCs w:val="1"/>
+          <w:sz w:val="34"/>
+          <w:szCs w:val="34"/>
+        </w:rPr>
+      </w:pPr>
+      <w:bookmarkStart w:colFirst="0" w:colLast="0" w:name="_8r1lrztzykag" w:id="1"/>
+      <w:bookmarkEnd w:id="1"/>
+      <w:r>
+        <w:rPr>
+          <w:b w:val="1"/>
+          <w:bCs w:val="1"/>
+          <w:sz w:val="34"/>
+          <w:szCs w:val="34"/>
+          <w:rtl w:val="0"/>
+        </w:rPr>
+        <w:t xml:space="preserve">1. Présentation du projet  </w:t>
       </w:r>
     </w:p>
     <w:p>
@@ -40,16 +65,53 @@
     </w:p>
     <w:p>
       <w:pPr>
+        <w:rPr/>
+      </w:pPr>
+      <w:r>
+        <w:rPr>
+          <w:rtl w:val="0"/>
+        </w:rPr>
+        <w:t xml:space="preserve">_________________________________________________________________________</w:t>
+      </w:r>
+    </w:p>
+    <w:p>
+      <w:pPr>
+        <w:rPr/>
+      </w:pPr>
+      <w:r>
+        <w:rPr>
+          <w:rtl w:val="0"/>
+        </w:rPr>
+      </w:r>
+    </w:p>
+    <w:p>
+      <w:pPr>
         <w:pStyle w:val="Heading2"/>
+        <w:rPr>
+          <w:b w:val="1"/>
+          <w:bCs w:val="1"/>
+        </w:rPr>
+      </w:pPr>
+      <w:bookmarkStart w:colFirst="0" w:colLast="0" w:name="_3ou493rqgymz" w:id="2"/>
+      <w:bookmarkEnd w:id="2"/>
+      <w:r>
+        <w:rPr>
+          <w:b w:val="1"/>
+          <w:bCs w:val="1"/>
+          <w:rtl w:val="0"/>
+        </w:rPr>
+        <w:t xml:space="preserve">1.1 Contexte : </w:t>
+      </w:r>
+    </w:p>
+    <w:p>
+      <w:pPr>
         <w:rPr/>
       </w:pPr>
-      <w:bookmarkStart w:colFirst="0" w:colLast="0" w:name="_3ou493rqgymz" w:id="1"/>
-      <w:bookmarkEnd w:id="1"/>
-      <w:r>
-        <w:rPr>
-          <w:rtl w:val="0"/>
-        </w:rPr>
-        <w:t xml:space="preserve">Contexte : </w:t>
+      <w:r>
+        <w:rPr>
+          <w:rtl w:val="0"/>
+        </w:rPr>
+        <w:t xml:space="preserve">Nous devons créer un projet intitulé : Application de gestion d’école.</w:t>
       </w:r>
     </w:p>
     <w:p>
@@ -60,7 +122,7 @@
         <w:rPr>
           <w:rtl w:val="0"/>
         </w:rPr>
-        <w:t xml:space="preserve">Nous devons créer un projet intitulé : Application de gestion d’école.</w:t>
+        <w:t xml:space="preserve">Dans cette application, nous devons réaliser un Modèle conceptuel de données (MEA) mettant en scène les différentes classes à créer ainsi que les relations.</w:t>
       </w:r>
     </w:p>
     <w:p>
@@ -71,7 +133,7 @@
         <w:rPr>
           <w:rtl w:val="0"/>
         </w:rPr>
-        <w:t xml:space="preserve">Dans cette application, nous devons réaliser un Modèle conceptuel de données (MEA) mettant en scene les différentes classe à créer ainsi que les relations.</w:t>
+        <w:t xml:space="preserve">Ensuite, nous devrons faire une maquette UI qui représentera graphiquement le rendu conceptuel du WindowsForm.</w:t>
       </w:r>
     </w:p>
     <w:p>
@@ -82,7 +144,7 @@
         <w:rPr>
           <w:rtl w:val="0"/>
         </w:rPr>
-        <w:t xml:space="preserve">Après, nous devrons faire une maquette UI qui représentera graphiquement le rendu conceptuel du WindowsForm.</w:t>
+        <w:t xml:space="preserve">Puis un schéma de classe UML qui nous permettras de réaliser le script SQL.</w:t>
       </w:r>
     </w:p>
     <w:p>
@@ -93,7 +155,7 @@
         <w:rPr>
           <w:rtl w:val="0"/>
         </w:rPr>
-        <w:t xml:space="preserve">Puis un shéma de classe UML qui nous permetteras de réaliser le script SQL.</w:t>
+        <w:t xml:space="preserve">Ensuite nous devrons finir par le code.</w:t>
       </w:r>
     </w:p>
     <w:p>
@@ -104,7 +166,6 @@
         <w:rPr>
           <w:rtl w:val="0"/>
         </w:rPr>
-        <w:t xml:space="preserve">Ensuite nous devrons finir par le code.</w:t>
       </w:r>
     </w:p>
     <w:p>
@@ -115,17 +176,7 @@
         <w:rPr>
           <w:rtl w:val="0"/>
         </w:rPr>
-      </w:r>
-    </w:p>
-    <w:p>
-      <w:pPr>
-        <w:rPr/>
-      </w:pPr>
-      <w:r>
-        <w:rPr>
-          <w:rtl w:val="0"/>
-        </w:rPr>
-        <w:t xml:space="preserve">___________________________________________________________________________</w:t>
+        <w:t xml:space="preserve">_________________________________________________________________________</w:t>
       </w:r>
     </w:p>
     <w:p>
@@ -998,37 +1049,73 @@
     </w:p>
     <w:p>
       <w:pPr>
+        <w:spacing w:before="240" w:lineRule="auto"/>
         <w:rPr/>
       </w:pPr>
       <w:r>
         <w:rPr>
           <w:rtl w:val="0"/>
         </w:rPr>
-        <w:t xml:space="preserve">___________________________________________________________________________</w:t>
-      </w:r>
-    </w:p>
-    <w:p>
-      <w:pPr>
+        <w:t xml:space="preserve">_________________________________________________________________________</w:t>
+        <w:br w:type="textWrapping"/>
+        <w:br w:type="textWrapping"/>
+      </w:r>
+    </w:p>
+    <w:p>
+      <w:pPr>
+        <w:pStyle w:val="Heading2"/>
+        <w:keepNext w:val="0"/>
+        <w:keepLines w:val="0"/>
+        <w:spacing w:after="80" w:lineRule="auto"/>
+        <w:rPr>
+          <w:b w:val="1"/>
+          <w:bCs w:val="1"/>
+          <w:sz w:val="34"/>
+          <w:szCs w:val="34"/>
+        </w:rPr>
+      </w:pPr>
+      <w:bookmarkStart w:colFirst="0" w:colLast="0" w:name="_5assiih50nmv" w:id="3"/>
+      <w:bookmarkEnd w:id="3"/>
+      <w:r>
+        <w:rPr>
+          <w:b w:val="1"/>
+          <w:bCs w:val="1"/>
+          <w:sz w:val="34"/>
+          <w:szCs w:val="34"/>
+          <w:rtl w:val="0"/>
+        </w:rPr>
+        <w:t xml:space="preserve">1.2 Objectif :</w:t>
+      </w:r>
+    </w:p>
+    <w:p>
+      <w:pPr>
+        <w:spacing w:after="240" w:before="240" w:lineRule="auto"/>
         <w:rPr/>
       </w:pPr>
       <w:r>
         <w:rPr>
           <w:rtl w:val="0"/>
         </w:rPr>
-      </w:r>
-    </w:p>
-    <w:p>
-      <w:pPr>
+        <w:t xml:space="preserve">Réaliser une application de gestion d'école fonctionnelle où les utilisateurs pourront se connecter et seront redirigés vers la page correspondante à leur statut.</w:t>
+        <w:br w:type="textWrapping"/>
+        <w:br w:type="textWrapping"/>
+      </w:r>
+    </w:p>
+    <w:p>
+      <w:pPr>
+        <w:spacing w:before="240" w:lineRule="auto"/>
         <w:rPr/>
       </w:pPr>
       <w:r>
         <w:rPr>
           <w:rtl w:val="0"/>
         </w:rPr>
-      </w:r>
-    </w:p>
-    <w:p>
-      <w:pPr>
+        <w:t xml:space="preserve">_________________________________________________________________________</w:t>
+      </w:r>
+    </w:p>
+    <w:p>
+      <w:pPr>
+        <w:spacing w:before="240" w:lineRule="auto"/>
         <w:rPr/>
       </w:pPr>
       <w:r>
@@ -1039,6 +1126,32 @@
     </w:p>
     <w:p>
       <w:pPr>
+        <w:pStyle w:val="Heading2"/>
+        <w:keepNext w:val="0"/>
+        <w:keepLines w:val="0"/>
+        <w:spacing w:after="80" w:lineRule="auto"/>
+        <w:rPr>
+          <w:b w:val="1"/>
+          <w:bCs w:val="1"/>
+          <w:sz w:val="34"/>
+          <w:szCs w:val="34"/>
+        </w:rPr>
+      </w:pPr>
+      <w:bookmarkStart w:colFirst="0" w:colLast="0" w:name="_t0ubiygezr94" w:id="4"/>
+      <w:bookmarkEnd w:id="4"/>
+      <w:r>
+        <w:rPr>
+          <w:b w:val="1"/>
+          <w:bCs w:val="1"/>
+          <w:sz w:val="34"/>
+          <w:szCs w:val="34"/>
+          <w:rtl w:val="0"/>
+        </w:rPr>
+        <w:t xml:space="preserve">2. Description des besoins</w:t>
+      </w:r>
+    </w:p>
+    <w:p>
+      <w:pPr>
         <w:rPr/>
       </w:pPr>
       <w:r>
@@ -1049,32 +1162,523 @@
     </w:p>
     <w:p>
       <w:pPr>
+        <w:spacing w:before="240" w:lineRule="auto"/>
         <w:rPr/>
       </w:pPr>
       <w:r>
         <w:rPr>
           <w:rtl w:val="0"/>
         </w:rPr>
-      </w:r>
-    </w:p>
-    <w:p>
-      <w:pPr>
+        <w:t xml:space="preserve">_________________________________________________________________________</w:t>
+        <w:br w:type="textWrapping"/>
+      </w:r>
+    </w:p>
+    <w:p>
+      <w:pPr>
+        <w:pStyle w:val="Heading2"/>
+        <w:keepNext w:val="0"/>
+        <w:keepLines w:val="0"/>
+        <w:spacing w:after="80" w:lineRule="auto"/>
+        <w:rPr>
+          <w:b w:val="1"/>
+          <w:bCs w:val="1"/>
+          <w:sz w:val="34"/>
+          <w:szCs w:val="34"/>
+        </w:rPr>
+      </w:pPr>
+      <w:bookmarkStart w:colFirst="0" w:colLast="0" w:name="_psg1o9todwuk" w:id="5"/>
+      <w:bookmarkEnd w:id="5"/>
+      <w:r>
+        <w:rPr>
+          <w:b w:val="1"/>
+          <w:bCs w:val="1"/>
+          <w:sz w:val="34"/>
+          <w:szCs w:val="34"/>
+          <w:rtl w:val="0"/>
+        </w:rPr>
+        <w:t xml:space="preserve">2.1 Fonctionnalités attendues :</w:t>
+      </w:r>
+    </w:p>
+    <w:p>
+      <w:pPr>
+        <w:pStyle w:val="Heading3"/>
+        <w:keepNext w:val="0"/>
+        <w:keepLines w:val="0"/>
+        <w:spacing w:before="280" w:lineRule="auto"/>
+        <w:rPr>
+          <w:b w:val="1"/>
+          <w:bCs w:val="1"/>
+          <w:color w:val="000000"/>
+          <w:sz w:val="26"/>
+          <w:szCs w:val="26"/>
+        </w:rPr>
+      </w:pPr>
+      <w:bookmarkStart w:colFirst="0" w:colLast="0" w:name="_b1ovahnnndja" w:id="6"/>
+      <w:bookmarkEnd w:id="6"/>
+      <w:r>
+        <w:rPr>
+          <w:b w:val="1"/>
+          <w:bCs w:val="1"/>
+          <w:color w:val="000000"/>
+          <w:sz w:val="26"/>
+          <w:szCs w:val="26"/>
+          <w:rtl w:val="0"/>
+        </w:rPr>
+        <w:t xml:space="preserve">Administrateur</w:t>
+      </w:r>
+    </w:p>
+    <w:p>
+      <w:pPr>
+        <w:numPr>
+          <w:ilvl w:val="0"/>
+          <w:numId w:val="3"/>
+        </w:numPr>
+        <w:spacing w:after="0" w:afterAutospacing="0" w:before="240" w:lineRule="auto"/>
+        <w:ind w:left="720" w:hanging="360"/>
+      </w:pPr>
+      <w:r>
+        <w:rPr>
+          <w:rtl w:val="0"/>
+        </w:rPr>
+        <w:tab/>
+        <w:br w:type="textWrapping"/>
+        <w:t xml:space="preserve">Créer des utilisateurs</w:t>
+        <w:br w:type="textWrapping"/>
+        <w:t xml:space="preserve"> </w:t>
+        <w:tab/>
+      </w:r>
+    </w:p>
+    <w:p>
+      <w:pPr>
+        <w:numPr>
+          <w:ilvl w:val="0"/>
+          <w:numId w:val="3"/>
+        </w:numPr>
+        <w:spacing w:after="0" w:afterAutospacing="0" w:before="0" w:beforeAutospacing="0" w:lineRule="auto"/>
+        <w:ind w:left="720" w:hanging="360"/>
+      </w:pPr>
+      <w:r>
+        <w:rPr>
+          <w:rtl w:val="0"/>
+        </w:rPr>
+        <w:t xml:space="preserve">Gérer les classes</w:t>
+        <w:br w:type="textWrapping"/>
+        <w:t xml:space="preserve"> </w:t>
+        <w:tab/>
+      </w:r>
+    </w:p>
+    <w:p>
+      <w:pPr>
+        <w:numPr>
+          <w:ilvl w:val="0"/>
+          <w:numId w:val="3"/>
+        </w:numPr>
+        <w:spacing w:after="0" w:afterAutospacing="0" w:before="0" w:beforeAutospacing="0" w:lineRule="auto"/>
+        <w:ind w:left="720" w:hanging="360"/>
+      </w:pPr>
+      <w:r>
+        <w:rPr>
+          <w:rtl w:val="0"/>
+        </w:rPr>
+        <w:t xml:space="preserve">Consulter toutes les données</w:t>
+        <w:br w:type="textWrapping"/>
+        <w:t xml:space="preserve"> </w:t>
+        <w:tab/>
+      </w:r>
+    </w:p>
+    <w:p>
+      <w:pPr>
+        <w:numPr>
+          <w:ilvl w:val="0"/>
+          <w:numId w:val="3"/>
+        </w:numPr>
+        <w:spacing w:after="240" w:before="0" w:beforeAutospacing="0" w:lineRule="auto"/>
+        <w:ind w:left="720" w:hanging="360"/>
+      </w:pPr>
+      <w:r>
+        <w:rPr>
+          <w:rtl w:val="0"/>
+        </w:rPr>
+        <w:t xml:space="preserve">Saisir les absences des professeurs</w:t>
+        <w:br w:type="textWrapping"/>
+      </w:r>
+    </w:p>
+    <w:p>
+      <w:pPr>
+        <w:pStyle w:val="Heading3"/>
+        <w:keepNext w:val="0"/>
+        <w:keepLines w:val="0"/>
+        <w:spacing w:before="280" w:lineRule="auto"/>
+        <w:rPr>
+          <w:b w:val="1"/>
+          <w:bCs w:val="1"/>
+          <w:color w:val="000000"/>
+          <w:sz w:val="26"/>
+          <w:szCs w:val="26"/>
+        </w:rPr>
+      </w:pPr>
+      <w:bookmarkStart w:colFirst="0" w:colLast="0" w:name="_4ui0frn6yeos" w:id="7"/>
+      <w:bookmarkEnd w:id="7"/>
+      <w:r>
+        <w:rPr>
+          <w:b w:val="1"/>
+          <w:bCs w:val="1"/>
+          <w:color w:val="000000"/>
+          <w:sz w:val="26"/>
+          <w:szCs w:val="26"/>
+          <w:rtl w:val="0"/>
+        </w:rPr>
+        <w:t xml:space="preserve">Professeur</w:t>
+      </w:r>
+    </w:p>
+    <w:p>
+      <w:pPr>
+        <w:numPr>
+          <w:ilvl w:val="0"/>
+          <w:numId w:val="2"/>
+        </w:numPr>
+        <w:spacing w:after="0" w:afterAutospacing="0" w:before="240" w:lineRule="auto"/>
+        <w:ind w:left="720" w:hanging="360"/>
+      </w:pPr>
+      <w:r>
+        <w:rPr>
+          <w:rtl w:val="0"/>
+        </w:rPr>
+        <w:tab/>
+        <w:br w:type="textWrapping"/>
+        <w:t xml:space="preserve">Saisir les notes</w:t>
+        <w:br w:type="textWrapping"/>
+        <w:t xml:space="preserve"> </w:t>
+        <w:tab/>
+      </w:r>
+    </w:p>
+    <w:p>
+      <w:pPr>
+        <w:numPr>
+          <w:ilvl w:val="0"/>
+          <w:numId w:val="2"/>
+        </w:numPr>
+        <w:spacing w:after="0" w:afterAutospacing="0" w:before="0" w:beforeAutospacing="0" w:lineRule="auto"/>
+        <w:ind w:left="720" w:hanging="360"/>
+      </w:pPr>
+      <w:r>
+        <w:rPr>
+          <w:rtl w:val="0"/>
+        </w:rPr>
+        <w:t xml:space="preserve">Saisir les absences des élèves</w:t>
+        <w:br w:type="textWrapping"/>
+        <w:t xml:space="preserve"> </w:t>
+        <w:tab/>
+      </w:r>
+    </w:p>
+    <w:p>
+      <w:pPr>
+        <w:numPr>
+          <w:ilvl w:val="0"/>
+          <w:numId w:val="2"/>
+        </w:numPr>
+        <w:spacing w:after="0" w:afterAutospacing="0" w:before="0" w:beforeAutospacing="0" w:lineRule="auto"/>
+        <w:ind w:left="720" w:hanging="360"/>
+      </w:pPr>
+      <w:r>
+        <w:rPr>
+          <w:rtl w:val="0"/>
+        </w:rPr>
+        <w:t xml:space="preserve">Consulter ses classes</w:t>
+        <w:br w:type="textWrapping"/>
+        <w:t xml:space="preserve"> </w:t>
+        <w:tab/>
+      </w:r>
+    </w:p>
+    <w:p>
+      <w:pPr>
+        <w:numPr>
+          <w:ilvl w:val="0"/>
+          <w:numId w:val="2"/>
+        </w:numPr>
+        <w:spacing w:after="240" w:before="0" w:beforeAutospacing="0" w:lineRule="auto"/>
+        <w:ind w:left="720" w:hanging="360"/>
+      </w:pPr>
+      <w:r>
+        <w:rPr>
+          <w:rtl w:val="0"/>
+        </w:rPr>
+        <w:t xml:space="preserve">Voir son emploi du temps</w:t>
+        <w:br w:type="textWrapping"/>
+      </w:r>
+    </w:p>
+    <w:p>
+      <w:pPr>
+        <w:pStyle w:val="Heading3"/>
+        <w:keepNext w:val="0"/>
+        <w:keepLines w:val="0"/>
+        <w:spacing w:before="280" w:lineRule="auto"/>
+        <w:rPr>
+          <w:b w:val="1"/>
+          <w:bCs w:val="1"/>
+          <w:color w:val="000000"/>
+          <w:sz w:val="26"/>
+          <w:szCs w:val="26"/>
+        </w:rPr>
+      </w:pPr>
+      <w:bookmarkStart w:colFirst="0" w:colLast="0" w:name="_mnbly2edlu4z" w:id="8"/>
+      <w:bookmarkEnd w:id="8"/>
+      <w:r>
+        <w:rPr>
+          <w:b w:val="1"/>
+          <w:bCs w:val="1"/>
+          <w:color w:val="000000"/>
+          <w:sz w:val="26"/>
+          <w:szCs w:val="26"/>
+          <w:rtl w:val="0"/>
+        </w:rPr>
+        <w:t xml:space="preserve">Élève</w:t>
+      </w:r>
+    </w:p>
+    <w:p>
+      <w:pPr>
+        <w:numPr>
+          <w:ilvl w:val="0"/>
+          <w:numId w:val="1"/>
+        </w:numPr>
+        <w:spacing w:after="0" w:afterAutospacing="0" w:before="240" w:lineRule="auto"/>
+        <w:ind w:left="720" w:hanging="360"/>
+      </w:pPr>
+      <w:r>
+        <w:rPr>
+          <w:rtl w:val="0"/>
+        </w:rPr>
+        <w:tab/>
+        <w:br w:type="textWrapping"/>
+        <w:t xml:space="preserve">Consulter ses notes</w:t>
+        <w:br w:type="textWrapping"/>
+        <w:t xml:space="preserve"> </w:t>
+        <w:tab/>
+      </w:r>
+    </w:p>
+    <w:p>
+      <w:pPr>
+        <w:numPr>
+          <w:ilvl w:val="0"/>
+          <w:numId w:val="1"/>
+        </w:numPr>
+        <w:spacing w:after="0" w:afterAutospacing="0" w:before="0" w:beforeAutospacing="0" w:lineRule="auto"/>
+        <w:ind w:left="720" w:hanging="360"/>
+      </w:pPr>
+      <w:r>
+        <w:rPr>
+          <w:rtl w:val="0"/>
+        </w:rPr>
+        <w:t xml:space="preserve">Consulter ses absences</w:t>
+        <w:br w:type="textWrapping"/>
+        <w:t xml:space="preserve"> </w:t>
+        <w:tab/>
+      </w:r>
+    </w:p>
+    <w:p>
+      <w:pPr>
+        <w:numPr>
+          <w:ilvl w:val="0"/>
+          <w:numId w:val="1"/>
+        </w:numPr>
+        <w:spacing w:after="240" w:before="0" w:beforeAutospacing="0" w:lineRule="auto"/>
+        <w:ind w:left="720" w:hanging="360"/>
+      </w:pPr>
+      <w:r>
+        <w:rPr>
+          <w:rtl w:val="0"/>
+        </w:rPr>
+        <w:t xml:space="preserve">Voir son emploi du temps</w:t>
+        <w:br w:type="textWrapping"/>
+        <w:br w:type="textWrapping"/>
+      </w:r>
+    </w:p>
+    <w:p>
+      <w:pPr>
+        <w:spacing w:before="240" w:lineRule="auto"/>
         <w:rPr/>
       </w:pPr>
       <w:r>
         <w:rPr>
           <w:rtl w:val="0"/>
         </w:rPr>
-      </w:r>
-    </w:p>
-    <w:p>
-      <w:pPr>
+        <w:t xml:space="preserve">_________________________________________________________________________</w:t>
+        <w:br w:type="textWrapping"/>
+        <w:br w:type="textWrapping"/>
+      </w:r>
+    </w:p>
+    <w:p>
+      <w:pPr>
+        <w:pStyle w:val="Heading2"/>
+        <w:keepNext w:val="0"/>
+        <w:keepLines w:val="0"/>
+        <w:spacing w:after="80" w:lineRule="auto"/>
+        <w:rPr>
+          <w:b w:val="1"/>
+          <w:bCs w:val="1"/>
+          <w:sz w:val="34"/>
+          <w:szCs w:val="34"/>
+        </w:rPr>
+      </w:pPr>
+      <w:bookmarkStart w:colFirst="0" w:colLast="0" w:name="_qzrcplrthhjt" w:id="9"/>
+      <w:bookmarkEnd w:id="9"/>
+      <w:r>
+        <w:rPr>
+          <w:b w:val="1"/>
+          <w:bCs w:val="1"/>
+          <w:sz w:val="34"/>
+          <w:szCs w:val="34"/>
+          <w:rtl w:val="0"/>
+        </w:rPr>
+        <w:t xml:space="preserve">2.2 Contraintes :</w:t>
+      </w:r>
+    </w:p>
+    <w:p>
+      <w:pPr>
+        <w:numPr>
+          <w:ilvl w:val="0"/>
+          <w:numId w:val="4"/>
+        </w:numPr>
+        <w:spacing w:after="0" w:afterAutospacing="0" w:before="240" w:lineRule="auto"/>
+        <w:ind w:left="720" w:hanging="360"/>
+      </w:pPr>
+      <w:r>
+        <w:rPr>
+          <w:rtl w:val="0"/>
+        </w:rPr>
+        <w:tab/>
+        <w:br w:type="textWrapping"/>
+        <w:t xml:space="preserve">Langage utilisé =&gt; </w:t>
+        <w:tab/>
+        <w:t xml:space="preserve">C#</w:t>
+        <w:br w:type="textWrapping"/>
+        <w:t xml:space="preserve"> </w:t>
+        <w:tab/>
+      </w:r>
+    </w:p>
+    <w:p>
+      <w:pPr>
+        <w:numPr>
+          <w:ilvl w:val="0"/>
+          <w:numId w:val="4"/>
+        </w:numPr>
+        <w:spacing w:after="0" w:afterAutospacing="0" w:before="0" w:beforeAutospacing="0" w:lineRule="auto"/>
+        <w:ind w:left="720" w:hanging="360"/>
+      </w:pPr>
+      <w:r>
+        <w:rPr>
+          <w:rtl w:val="0"/>
+        </w:rPr>
+        <w:t xml:space="preserve">Base de données =&gt; PhpMyAdmin</w:t>
+        <w:br w:type="textWrapping"/>
+        <w:t xml:space="preserve"> </w:t>
+        <w:tab/>
+      </w:r>
+    </w:p>
+    <w:p>
+      <w:pPr>
+        <w:numPr>
+          <w:ilvl w:val="0"/>
+          <w:numId w:val="4"/>
+        </w:numPr>
+        <w:spacing w:after="0" w:afterAutospacing="0" w:before="0" w:beforeAutospacing="0" w:lineRule="auto"/>
+        <w:ind w:left="720" w:hanging="360"/>
+      </w:pPr>
+      <w:r>
+        <w:rPr>
+          <w:rtl w:val="0"/>
+        </w:rPr>
+        <w:t xml:space="preserve">Type d'application =&gt; Web</w:t>
+        <w:br w:type="textWrapping"/>
+        <w:t xml:space="preserve"> </w:t>
+        <w:tab/>
+      </w:r>
+    </w:p>
+    <w:p>
+      <w:pPr>
+        <w:numPr>
+          <w:ilvl w:val="0"/>
+          <w:numId w:val="4"/>
+        </w:numPr>
+        <w:spacing w:after="0" w:afterAutospacing="0" w:before="0" w:beforeAutospacing="0" w:lineRule="auto"/>
+        <w:ind w:left="720" w:hanging="360"/>
+      </w:pPr>
+      <w:r>
+        <w:rPr>
+          <w:rtl w:val="0"/>
+        </w:rPr>
+        <w:t xml:space="preserve">Sécurité =&gt; Authentification obligatoire</w:t>
+        <w:br w:type="textWrapping"/>
+        <w:t xml:space="preserve"> </w:t>
+        <w:tab/>
+      </w:r>
+    </w:p>
+    <w:p>
+      <w:pPr>
+        <w:numPr>
+          <w:ilvl w:val="0"/>
+          <w:numId w:val="4"/>
+        </w:numPr>
+        <w:spacing w:after="0" w:afterAutospacing="0" w:before="0" w:beforeAutospacing="0" w:lineRule="auto"/>
+        <w:ind w:left="720" w:hanging="360"/>
+      </w:pPr>
+      <w:r>
+        <w:rPr>
+          <w:rtl w:val="0"/>
+        </w:rPr>
+        <w:t xml:space="preserve">Schéma de classe</w:t>
+        <w:br w:type="textWrapping"/>
+        <w:t xml:space="preserve"> </w:t>
+        <w:tab/>
+      </w:r>
+    </w:p>
+    <w:p>
+      <w:pPr>
+        <w:numPr>
+          <w:ilvl w:val="0"/>
+          <w:numId w:val="4"/>
+        </w:numPr>
+        <w:spacing w:after="0" w:afterAutospacing="0" w:before="0" w:beforeAutospacing="0" w:lineRule="auto"/>
+        <w:ind w:left="720" w:hanging="360"/>
+      </w:pPr>
+      <w:r>
+        <w:rPr>
+          <w:rtl w:val="0"/>
+        </w:rPr>
+        <w:t xml:space="preserve">Modèle Conceptuel de Données</w:t>
+        <w:br w:type="textWrapping"/>
+        <w:t xml:space="preserve"> </w:t>
+        <w:tab/>
+      </w:r>
+    </w:p>
+    <w:p>
+      <w:pPr>
+        <w:numPr>
+          <w:ilvl w:val="0"/>
+          <w:numId w:val="4"/>
+        </w:numPr>
+        <w:spacing w:after="240" w:before="0" w:beforeAutospacing="0" w:lineRule="auto"/>
+        <w:ind w:left="720" w:hanging="360"/>
+      </w:pPr>
+      <w:r>
+        <w:rPr>
+          <w:rtl w:val="0"/>
+        </w:rPr>
+        <w:t xml:space="preserve">Maquette UI</w:t>
+        <w:br w:type="textWrapping"/>
+      </w:r>
+    </w:p>
+    <w:p>
+      <w:pPr>
+        <w:spacing w:after="240" w:before="240" w:lineRule="auto"/>
         <w:rPr/>
       </w:pPr>
       <w:r>
         <w:rPr>
           <w:rtl w:val="0"/>
         </w:rPr>
+        <w:br w:type="textWrapping"/>
+        <w:br w:type="textWrapping"/>
       </w:r>
     </w:p>
     <w:p>
@@ -1087,48 +1691,11 @@
         </w:rPr>
       </w:r>
     </w:p>
-    <w:p>
-      <w:pPr>
-        <w:rPr/>
-      </w:pPr>
-      <w:r>
-        <w:rPr>
-          <w:rtl w:val="0"/>
-        </w:rPr>
-        <w:t xml:space="preserve"> </w:t>
-      </w:r>
-      <w:hyperlink r:id="rId6">
-        <w:r>
-          <w:rPr>
-            <w:color w:val="1155cc"/>
-            <w:u w:val="single"/>
-            <w:rtl w:val="0"/>
-          </w:rPr>
-          <w:t xml:space="preserve">https://prod.liveshare.vsengsaas.visualstudio.com/join?7797C24C9C2469E7404A81D18E8FA09AFA77</w:t>
-        </w:r>
-      </w:hyperlink>
-      <w:r>
-        <w:rPr>
-          <w:rtl w:val="0"/>
-        </w:rPr>
-      </w:r>
-    </w:p>
-    <w:p>
-      <w:pPr>
-        <w:rPr/>
-      </w:pPr>
-      <w:r>
-        <w:rPr>
-          <w:rtl w:val="0"/>
-        </w:rPr>
-        <w:t xml:space="preserve">https://prod.liveshare.vsengsaas.visualstudio.com/join?7797C24C9C2469E7404A81D18E8FA09AFA77</w:t>
-      </w:r>
-    </w:p>
     <w:sectPr>
-      <w:headerReference r:id="rId7" w:type="default"/>
-      <w:headerReference r:id="rId8" w:type="first"/>
-      <w:footerReference r:id="rId9" w:type="default"/>
-      <w:footerReference r:id="rId10" w:type="first"/>
+      <w:headerReference r:id="rId6" w:type="default"/>
+      <w:headerReference r:id="rId7" w:type="first"/>
+      <w:footerReference r:id="rId8" w:type="default"/>
+      <w:footerReference r:id="rId9" w:type="first"/>
       <w:pgSz w:h="16834" w:w="11909" w:orient="portrait"/>
       <w:pgMar w:bottom="1440" w:top="1440" w:left="1440" w:right="1440" w:header="720" w:footer="720"/>
       <w:pgNumType w:start="1"/>
@@ -1198,7 +1765,460 @@
 </file>
 
 <file path=word/numbering.xml><?xml version="1.0" encoding="utf-8"?>
-<w:numbering xmlns:mc="http://schemas.openxmlformats.org/markup-compatibility/2006" xmlns:o="urn:schemas-microsoft-com:office:office" xmlns:r="http://schemas.openxmlformats.org/officeDocument/2006/relationships" xmlns:m="http://schemas.openxmlformats.org/officeDocument/2006/math" xmlns:v="urn:schemas-microsoft-com:vml" xmlns:wp="http://schemas.openxmlformats.org/drawingml/2006/wordprocessingDrawing" xmlns:w10="urn:schemas-microsoft-com:office:word" xmlns:w="http://schemas.openxmlformats.org/wordprocessingml/2006/main" xmlns:wne="http://schemas.microsoft.com/office/word/2006/wordml" xmlns:sl="http://schemas.openxmlformats.org/schemaLibrary/2006/main" xmlns:a="http://schemas.openxmlformats.org/drawingml/2006/main" xmlns:pic="http://schemas.openxmlformats.org/drawingml/2006/picture" xmlns:c="http://schemas.openxmlformats.org/drawingml/2006/chart" xmlns:lc="http://schemas.openxmlformats.org/drawingml/2006/lockedCanvas" xmlns:dgm="http://schemas.openxmlformats.org/drawingml/2006/diagram" xmlns:wps="http://schemas.microsoft.com/office/word/2010/wordprocessingShape" xmlns:wpg="http://schemas.microsoft.com/office/word/2010/wordprocessingGroup" xmlns:w14="http://schemas.microsoft.com/office/word/2010/wordml" xmlns:w15="http://schemas.microsoft.com/office/word/2012/wordml" xmlns:w16="http://schemas.microsoft.com/office/word/2018/wordml" xmlns:w16cex="http://schemas.microsoft.com/office/word/2018/wordml/cex" xmlns:w16cid="http://schemas.microsoft.com/office/word/2016/wordml/cid" xmlns="http://schemas.microsoft.com/office/tasks/2019/documenttasks" xmlns:cr="http://schemas.microsoft.com/office/comments/2020/reactions"/>
+<w:numbering xmlns:mc="http://schemas.openxmlformats.org/markup-compatibility/2006" xmlns:o="urn:schemas-microsoft-com:office:office" xmlns:r="http://schemas.openxmlformats.org/officeDocument/2006/relationships" xmlns:m="http://schemas.openxmlformats.org/officeDocument/2006/math" xmlns:v="urn:schemas-microsoft-com:vml" xmlns:wp="http://schemas.openxmlformats.org/drawingml/2006/wordprocessingDrawing" xmlns:w10="urn:schemas-microsoft-com:office:word" xmlns:w="http://schemas.openxmlformats.org/wordprocessingml/2006/main" xmlns:wne="http://schemas.microsoft.com/office/word/2006/wordml" xmlns:sl="http://schemas.openxmlformats.org/schemaLibrary/2006/main" xmlns:a="http://schemas.openxmlformats.org/drawingml/2006/main" xmlns:pic="http://schemas.openxmlformats.org/drawingml/2006/picture" xmlns:c="http://schemas.openxmlformats.org/drawingml/2006/chart" xmlns:lc="http://schemas.openxmlformats.org/drawingml/2006/lockedCanvas" xmlns:dgm="http://schemas.openxmlformats.org/drawingml/2006/diagram" xmlns:wps="http://schemas.microsoft.com/office/word/2010/wordprocessingShape" xmlns:wpg="http://schemas.microsoft.com/office/word/2010/wordprocessingGroup" xmlns:w14="http://schemas.microsoft.com/office/word/2010/wordml" xmlns:w15="http://schemas.microsoft.com/office/word/2012/wordml" xmlns:w16="http://schemas.microsoft.com/office/word/2018/wordml" xmlns:w16cex="http://schemas.microsoft.com/office/word/2018/wordml/cex" xmlns:w16cid="http://schemas.microsoft.com/office/word/2016/wordml/cid" xmlns="http://schemas.microsoft.com/office/tasks/2019/documenttasks" xmlns:cr="http://schemas.microsoft.com/office/comments/2020/reactions">
+  <w:abstractNum w:abstractNumId="1">
+    <w:lvl w:ilvl="0">
+      <w:start w:val="1"/>
+      <w:numFmt w:val="bullet"/>
+      <w:lvlText w:val="●"/>
+      <w:lvlJc w:val="left"/>
+      <w:pPr>
+        <w:ind w:left="720" w:hanging="360"/>
+      </w:pPr>
+      <w:rPr>
+        <w:u w:val="none"/>
+      </w:rPr>
+    </w:lvl>
+    <w:lvl w:ilvl="1">
+      <w:start w:val="1"/>
+      <w:numFmt w:val="bullet"/>
+      <w:lvlText w:val="○"/>
+      <w:lvlJc w:val="left"/>
+      <w:pPr>
+        <w:ind w:left="1440" w:hanging="360"/>
+      </w:pPr>
+      <w:rPr>
+        <w:u w:val="none"/>
+      </w:rPr>
+    </w:lvl>
+    <w:lvl w:ilvl="2">
+      <w:start w:val="1"/>
+      <w:numFmt w:val="bullet"/>
+      <w:lvlText w:val="■"/>
+      <w:lvlJc w:val="left"/>
+      <w:pPr>
+        <w:ind w:left="2160" w:hanging="360"/>
+      </w:pPr>
+      <w:rPr>
+        <w:u w:val="none"/>
+      </w:rPr>
+    </w:lvl>
+    <w:lvl w:ilvl="3">
+      <w:start w:val="1"/>
+      <w:numFmt w:val="bullet"/>
+      <w:lvlText w:val="●"/>
+      <w:lvlJc w:val="left"/>
+      <w:pPr>
+        <w:ind w:left="2880" w:hanging="360"/>
+      </w:pPr>
+      <w:rPr>
+        <w:u w:val="none"/>
+      </w:rPr>
+    </w:lvl>
+    <w:lvl w:ilvl="4">
+      <w:start w:val="1"/>
+      <w:numFmt w:val="bullet"/>
+      <w:lvlText w:val="○"/>
+      <w:lvlJc w:val="left"/>
+      <w:pPr>
+        <w:ind w:left="3600" w:hanging="360"/>
+      </w:pPr>
+      <w:rPr>
+        <w:u w:val="none"/>
+      </w:rPr>
+    </w:lvl>
+    <w:lvl w:ilvl="5">
+      <w:start w:val="1"/>
+      <w:numFmt w:val="bullet"/>
+      <w:lvlText w:val="■"/>
+      <w:lvlJc w:val="left"/>
+      <w:pPr>
+        <w:ind w:left="4320" w:hanging="360"/>
+      </w:pPr>
+      <w:rPr>
+        <w:u w:val="none"/>
+      </w:rPr>
+    </w:lvl>
+    <w:lvl w:ilvl="6">
+      <w:start w:val="1"/>
+      <w:numFmt w:val="bullet"/>
+      <w:lvlText w:val="●"/>
+      <w:lvlJc w:val="left"/>
+      <w:pPr>
+        <w:ind w:left="5040" w:hanging="360"/>
+      </w:pPr>
+      <w:rPr>
+        <w:u w:val="none"/>
+      </w:rPr>
+    </w:lvl>
+    <w:lvl w:ilvl="7">
+      <w:start w:val="1"/>
+      <w:numFmt w:val="bullet"/>
+      <w:lvlText w:val="○"/>
+      <w:lvlJc w:val="left"/>
+      <w:pPr>
+        <w:ind w:left="5760" w:hanging="360"/>
+      </w:pPr>
+      <w:rPr>
+        <w:u w:val="none"/>
+      </w:rPr>
+    </w:lvl>
+    <w:lvl w:ilvl="8">
+      <w:start w:val="1"/>
+      <w:numFmt w:val="bullet"/>
+      <w:lvlText w:val="■"/>
+      <w:lvlJc w:val="left"/>
+      <w:pPr>
+        <w:ind w:left="6480" w:hanging="360"/>
+      </w:pPr>
+      <w:rPr>
+        <w:u w:val="none"/>
+      </w:rPr>
+    </w:lvl>
+  </w:abstractNum>
+  <w:abstractNum w:abstractNumId="2">
+    <w:lvl w:ilvl="0">
+      <w:start w:val="1"/>
+      <w:numFmt w:val="bullet"/>
+      <w:lvlText w:val="●"/>
+      <w:lvlJc w:val="left"/>
+      <w:pPr>
+        <w:ind w:left="720" w:hanging="360"/>
+      </w:pPr>
+      <w:rPr>
+        <w:u w:val="none"/>
+      </w:rPr>
+    </w:lvl>
+    <w:lvl w:ilvl="1">
+      <w:start w:val="1"/>
+      <w:numFmt w:val="bullet"/>
+      <w:lvlText w:val="○"/>
+      <w:lvlJc w:val="left"/>
+      <w:pPr>
+        <w:ind w:left="1440" w:hanging="360"/>
+      </w:pPr>
+      <w:rPr>
+        <w:u w:val="none"/>
+      </w:rPr>
+    </w:lvl>
+    <w:lvl w:ilvl="2">
+      <w:start w:val="1"/>
+      <w:numFmt w:val="bullet"/>
+      <w:lvlText w:val="■"/>
+      <w:lvlJc w:val="left"/>
+      <w:pPr>
+        <w:ind w:left="2160" w:hanging="360"/>
+      </w:pPr>
+      <w:rPr>
+        <w:u w:val="none"/>
+      </w:rPr>
+    </w:lvl>
+    <w:lvl w:ilvl="3">
+      <w:start w:val="1"/>
+      <w:numFmt w:val="bullet"/>
+      <w:lvlText w:val="●"/>
+      <w:lvlJc w:val="left"/>
+      <w:pPr>
+        <w:ind w:left="2880" w:hanging="360"/>
+      </w:pPr>
+      <w:rPr>
+        <w:u w:val="none"/>
+      </w:rPr>
+    </w:lvl>
+    <w:lvl w:ilvl="4">
+      <w:start w:val="1"/>
+      <w:numFmt w:val="bullet"/>
+      <w:lvlText w:val="○"/>
+      <w:lvlJc w:val="left"/>
+      <w:pPr>
+        <w:ind w:left="3600" w:hanging="360"/>
+      </w:pPr>
+      <w:rPr>
+        <w:u w:val="none"/>
+      </w:rPr>
+    </w:lvl>
+    <w:lvl w:ilvl="5">
+      <w:start w:val="1"/>
+      <w:numFmt w:val="bullet"/>
+      <w:lvlText w:val="■"/>
+      <w:lvlJc w:val="left"/>
+      <w:pPr>
+        <w:ind w:left="4320" w:hanging="360"/>
+      </w:pPr>
+      <w:rPr>
+        <w:u w:val="none"/>
+      </w:rPr>
+    </w:lvl>
+    <w:lvl w:ilvl="6">
+      <w:start w:val="1"/>
+      <w:numFmt w:val="bullet"/>
+      <w:lvlText w:val="●"/>
+      <w:lvlJc w:val="left"/>
+      <w:pPr>
+        <w:ind w:left="5040" w:hanging="360"/>
+      </w:pPr>
+      <w:rPr>
+        <w:u w:val="none"/>
+      </w:rPr>
+    </w:lvl>
+    <w:lvl w:ilvl="7">
+      <w:start w:val="1"/>
+      <w:numFmt w:val="bullet"/>
+      <w:lvlText w:val="○"/>
+      <w:lvlJc w:val="left"/>
+      <w:pPr>
+        <w:ind w:left="5760" w:hanging="360"/>
+      </w:pPr>
+      <w:rPr>
+        <w:u w:val="none"/>
+      </w:rPr>
+    </w:lvl>
+    <w:lvl w:ilvl="8">
+      <w:start w:val="1"/>
+      <w:numFmt w:val="bullet"/>
+      <w:lvlText w:val="■"/>
+      <w:lvlJc w:val="left"/>
+      <w:pPr>
+        <w:ind w:left="6480" w:hanging="360"/>
+      </w:pPr>
+      <w:rPr>
+        <w:u w:val="none"/>
+      </w:rPr>
+    </w:lvl>
+  </w:abstractNum>
+  <w:abstractNum w:abstractNumId="3">
+    <w:lvl w:ilvl="0">
+      <w:start w:val="1"/>
+      <w:numFmt w:val="bullet"/>
+      <w:lvlText w:val="●"/>
+      <w:lvlJc w:val="left"/>
+      <w:pPr>
+        <w:ind w:left="720" w:hanging="360"/>
+      </w:pPr>
+      <w:rPr>
+        <w:u w:val="none"/>
+      </w:rPr>
+    </w:lvl>
+    <w:lvl w:ilvl="1">
+      <w:start w:val="1"/>
+      <w:numFmt w:val="bullet"/>
+      <w:lvlText w:val="○"/>
+      <w:lvlJc w:val="left"/>
+      <w:pPr>
+        <w:ind w:left="1440" w:hanging="360"/>
+      </w:pPr>
+      <w:rPr>
+        <w:u w:val="none"/>
+      </w:rPr>
+    </w:lvl>
+    <w:lvl w:ilvl="2">
+      <w:start w:val="1"/>
+      <w:numFmt w:val="bullet"/>
+      <w:lvlText w:val="■"/>
+      <w:lvlJc w:val="left"/>
+      <w:pPr>
+        <w:ind w:left="2160" w:hanging="360"/>
+      </w:pPr>
+      <w:rPr>
+        <w:u w:val="none"/>
+      </w:rPr>
+    </w:lvl>
+    <w:lvl w:ilvl="3">
+      <w:start w:val="1"/>
+      <w:numFmt w:val="bullet"/>
+      <w:lvlText w:val="●"/>
+      <w:lvlJc w:val="left"/>
+      <w:pPr>
+        <w:ind w:left="2880" w:hanging="360"/>
+      </w:pPr>
+      <w:rPr>
+        <w:u w:val="none"/>
+      </w:rPr>
+    </w:lvl>
+    <w:lvl w:ilvl="4">
+      <w:start w:val="1"/>
+      <w:numFmt w:val="bullet"/>
+      <w:lvlText w:val="○"/>
+      <w:lvlJc w:val="left"/>
+      <w:pPr>
+        <w:ind w:left="3600" w:hanging="360"/>
+      </w:pPr>
+      <w:rPr>
+        <w:u w:val="none"/>
+      </w:rPr>
+    </w:lvl>
+    <w:lvl w:ilvl="5">
+      <w:start w:val="1"/>
+      <w:numFmt w:val="bullet"/>
+      <w:lvlText w:val="■"/>
+      <w:lvlJc w:val="left"/>
+      <w:pPr>
+        <w:ind w:left="4320" w:hanging="360"/>
+      </w:pPr>
+      <w:rPr>
+        <w:u w:val="none"/>
+      </w:rPr>
+    </w:lvl>
+    <w:lvl w:ilvl="6">
+      <w:start w:val="1"/>
+      <w:numFmt w:val="bullet"/>
+      <w:lvlText w:val="●"/>
+      <w:lvlJc w:val="left"/>
+      <w:pPr>
+        <w:ind w:left="5040" w:hanging="360"/>
+      </w:pPr>
+      <w:rPr>
+        <w:u w:val="none"/>
+      </w:rPr>
+    </w:lvl>
+    <w:lvl w:ilvl="7">
+      <w:start w:val="1"/>
+      <w:numFmt w:val="bullet"/>
+      <w:lvlText w:val="○"/>
+      <w:lvlJc w:val="left"/>
+      <w:pPr>
+        <w:ind w:left="5760" w:hanging="360"/>
+      </w:pPr>
+      <w:rPr>
+        <w:u w:val="none"/>
+      </w:rPr>
+    </w:lvl>
+    <w:lvl w:ilvl="8">
+      <w:start w:val="1"/>
+      <w:numFmt w:val="bullet"/>
+      <w:lvlText w:val="■"/>
+      <w:lvlJc w:val="left"/>
+      <w:pPr>
+        <w:ind w:left="6480" w:hanging="360"/>
+      </w:pPr>
+      <w:rPr>
+        <w:u w:val="none"/>
+      </w:rPr>
+    </w:lvl>
+  </w:abstractNum>
+  <w:abstractNum w:abstractNumId="4">
+    <w:lvl w:ilvl="0">
+      <w:start w:val="1"/>
+      <w:numFmt w:val="bullet"/>
+      <w:lvlText w:val="●"/>
+      <w:lvlJc w:val="left"/>
+      <w:pPr>
+        <w:ind w:left="720" w:hanging="360"/>
+      </w:pPr>
+      <w:rPr>
+        <w:u w:val="none"/>
+      </w:rPr>
+    </w:lvl>
+    <w:lvl w:ilvl="1">
+      <w:start w:val="1"/>
+      <w:numFmt w:val="bullet"/>
+      <w:lvlText w:val="○"/>
+      <w:lvlJc w:val="left"/>
+      <w:pPr>
+        <w:ind w:left="1440" w:hanging="360"/>
+      </w:pPr>
+      <w:rPr>
+        <w:u w:val="none"/>
+      </w:rPr>
+    </w:lvl>
+    <w:lvl w:ilvl="2">
+      <w:start w:val="1"/>
+      <w:numFmt w:val="bullet"/>
+      <w:lvlText w:val="■"/>
+      <w:lvlJc w:val="left"/>
+      <w:pPr>
+        <w:ind w:left="2160" w:hanging="360"/>
+      </w:pPr>
+      <w:rPr>
+        <w:u w:val="none"/>
+      </w:rPr>
+    </w:lvl>
+    <w:lvl w:ilvl="3">
+      <w:start w:val="1"/>
+      <w:numFmt w:val="bullet"/>
+      <w:lvlText w:val="●"/>
+      <w:lvlJc w:val="left"/>
+      <w:pPr>
+        <w:ind w:left="2880" w:hanging="360"/>
+      </w:pPr>
+      <w:rPr>
+        <w:u w:val="none"/>
+      </w:rPr>
+    </w:lvl>
+    <w:lvl w:ilvl="4">
+      <w:start w:val="1"/>
+      <w:numFmt w:val="bullet"/>
+      <w:lvlText w:val="○"/>
+      <w:lvlJc w:val="left"/>
+      <w:pPr>
+        <w:ind w:left="3600" w:hanging="360"/>
+      </w:pPr>
+      <w:rPr>
+        <w:u w:val="none"/>
+      </w:rPr>
+    </w:lvl>
+    <w:lvl w:ilvl="5">
+      <w:start w:val="1"/>
+      <w:numFmt w:val="bullet"/>
+      <w:lvlText w:val="■"/>
+      <w:lvlJc w:val="left"/>
+      <w:pPr>
+        <w:ind w:left="4320" w:hanging="360"/>
+      </w:pPr>
+      <w:rPr>
+        <w:u w:val="none"/>
+      </w:rPr>
+    </w:lvl>
+    <w:lvl w:ilvl="6">
+      <w:start w:val="1"/>
+      <w:numFmt w:val="bullet"/>
+      <w:lvlText w:val="●"/>
+      <w:lvlJc w:val="left"/>
+      <w:pPr>
+        <w:ind w:left="5040" w:hanging="360"/>
+      </w:pPr>
+      <w:rPr>
+        <w:u w:val="none"/>
+      </w:rPr>
+    </w:lvl>
+    <w:lvl w:ilvl="7">
+      <w:start w:val="1"/>
+      <w:numFmt w:val="bullet"/>
+      <w:lvlText w:val="○"/>
+      <w:lvlJc w:val="left"/>
+      <w:pPr>
+        <w:ind w:left="5760" w:hanging="360"/>
+      </w:pPr>
+      <w:rPr>
+        <w:u w:val="none"/>
+      </w:rPr>
+    </w:lvl>
+    <w:lvl w:ilvl="8">
+      <w:start w:val="1"/>
+      <w:numFmt w:val="bullet"/>
+      <w:lvlText w:val="■"/>
+      <w:lvlJc w:val="left"/>
+      <w:pPr>
+        <w:ind w:left="6480" w:hanging="360"/>
+      </w:pPr>
+      <w:rPr>
+        <w:u w:val="none"/>
+      </w:rPr>
+    </w:lvl>
+  </w:abstractNum>
+  <w:num w:numId="1">
+    <w:abstractNumId w:val="1"/>
+  </w:num>
+  <w:num w:numId="2">
+    <w:abstractNumId w:val="2"/>
+  </w:num>
+  <w:num w:numId="3">
+    <w:abstractNumId w:val="3"/>
+  </w:num>
+  <w:num w:numId="4">
+    <w:abstractNumId w:val="4"/>
+  </w:num>
+</w:numbering>
 </file>
 
 <file path=word/styles.xml><?xml version="1.0" encoding="utf-8"?>

</xml_diff>